<commit_message>
590 syllabus proof: University section in Word, clean links, no internal notes
- Word: include University policies and resources (was silently dropped);
  drop the instructor checklist and adaptation sources; strip markdown
  asterisks from link labels; 'Course Policies' heading
- syllabus.md: dead Minnesota link replaced by 'link posted on Canvas';
  removed 479 note, 'to be selected' readings, 'confirmed as' phrasing,
  duplicated peer-sharing sentences; Session 7 wording for students

Co-Authored-By: Claude Opus 5.5 <noreply@anthropic.com>
</commit_message>
<xml_diff>
--- a/courses/590-fall-2026/syllabus/University-of-Illinois-Urbana-Champaign-Syllabus-590-Fall-2026.docx
+++ b/courses/590-fall-2026/syllabus/University-of-Illinois-Urbana-Champaign-Syllabus-590-Fall-2026.docx
@@ -1111,14 +1111,34 @@
           <w:b w:val="0"/>
           <w:i w:val="0"/>
         </w:rPr>
-        <w:t xml:space="preserve">University of Minnesota Libraries. (n.d.). </w:t>
+        <w:t>A short guide to writing research questions (link posted on Canvas).</w:t>
+      </w:r>
+    </w:p>
+    <w:p>
+      <w:pPr>
+        <w:pStyle w:val="Heading2"/>
+      </w:pPr>
+      <w:r>
+        <w:t>Session 2 · Article anatomy, review design and mapping a field</w:t>
+      </w:r>
+    </w:p>
+    <w:p>
+      <w:pPr>
+        <w:pStyle w:val="ListBullet"/>
+      </w:pPr>
+      <w:r>
+        <w:rPr>
+          <w:b w:val="0"/>
+          <w:i w:val="0"/>
+        </w:rPr>
+        <w:t xml:space="preserve">Purdue Online Writing Lab. (n.d.). </w:t>
       </w:r>
       <w:hyperlink r:id="rId55">
         <w:r>
           <w:rPr>
             <w:u w:val="single"/>
           </w:rPr>
-          <w:t>*Characteristics of a good research question*</w:t>
+          <w:t>Writing a literature review</w:t>
         </w:r>
       </w:hyperlink>
       <w:r>
@@ -1126,15 +1146,7 @@
           <w:b w:val="0"/>
           <w:i w:val="0"/>
         </w:rPr>
-        <w:t>. Literature Searching research guide.</w:t>
-      </w:r>
-    </w:p>
-    <w:p>
-      <w:pPr>
-        <w:pStyle w:val="Heading2"/>
-      </w:pPr>
-      <w:r>
-        <w:t>Session 2 · Article anatomy, review design and mapping a field</w:t>
+        <w:t>. Purdue University.</w:t>
       </w:r>
     </w:p>
     <w:p>
@@ -1146,50 +1158,23 @@
           <w:b w:val="0"/>
           <w:i w:val="0"/>
         </w:rPr>
-        <w:t xml:space="preserve">Purdue Online Writing Lab. (n.d.). </w:t>
+        <w:t xml:space="preserve">In class: Keerthiraj, &amp; Misra, A. (2025). Who owns the future? AI, digital sovereignty, and the politics of knowledge. </w:t>
+      </w:r>
+      <w:r>
+        <w:rPr>
+          <w:b w:val="0"/>
+          <w:i/>
+        </w:rPr>
+        <w:t>AI &amp; Society</w:t>
+      </w:r>
+      <w:r>
+        <w:rPr>
+          <w:b w:val="0"/>
+          <w:i w:val="0"/>
+        </w:rPr>
+        <w:t xml:space="preserve">. </w:t>
       </w:r>
       <w:hyperlink r:id="rId56">
-        <w:r>
-          <w:rPr>
-            <w:u w:val="single"/>
-          </w:rPr>
-          <w:t>*Writing a literature review*</w:t>
-        </w:r>
-      </w:hyperlink>
-      <w:r>
-        <w:rPr>
-          <w:b w:val="0"/>
-          <w:i w:val="0"/>
-        </w:rPr>
-        <w:t>. Purdue University.</w:t>
-      </w:r>
-    </w:p>
-    <w:p>
-      <w:pPr>
-        <w:pStyle w:val="ListBullet"/>
-      </w:pPr>
-      <w:r>
-        <w:rPr>
-          <w:b w:val="0"/>
-          <w:i w:val="0"/>
-        </w:rPr>
-        <w:t xml:space="preserve">In class: Keerthiraj, &amp; Misra, A. (2025). Who owns the future? AI, digital sovereignty, and the politics of knowledge. </w:t>
-      </w:r>
-      <w:r>
-        <w:rPr>
-          <w:b w:val="0"/>
-          <w:i/>
-        </w:rPr>
-        <w:t>AI &amp; Society</w:t>
-      </w:r>
-      <w:r>
-        <w:rPr>
-          <w:b w:val="0"/>
-          <w:i w:val="0"/>
-        </w:rPr>
-        <w:t xml:space="preserve">. </w:t>
-      </w:r>
-      <w:hyperlink r:id="rId57">
         <w:r>
           <w:rPr>
             <w:u w:val="single"/>
@@ -1223,7 +1208,7 @@
         </w:rPr>
         <w:t xml:space="preserve">, Article 105473. </w:t>
       </w:r>
-      <w:hyperlink r:id="rId58">
+      <w:hyperlink r:id="rId57">
         <w:r>
           <w:rPr>
             <w:u w:val="single"/>
@@ -1291,12 +1276,12 @@
         </w:rPr>
         <w:t xml:space="preserve">. Cambridge University Press. </w:t>
       </w:r>
-      <w:hyperlink r:id="rId59">
+      <w:hyperlink r:id="rId58">
         <w:r>
           <w:rPr>
             <w:u w:val="single"/>
           </w:rPr>
-          <w:t>University Library: online, in *The two cultures* with Stefan Collini's introduction</w:t>
+          <w:t>University Library: online, in The two cultures with Stefan Collini's introduction</w:t>
         </w:r>
       </w:hyperlink>
     </w:p>
@@ -1333,7 +1318,7 @@
         </w:rPr>
         <w:t xml:space="preserve"> (pp. 271–313). University of Illinois Press. </w:t>
       </w:r>
-      <w:hyperlink r:id="rId60">
+      <w:hyperlink r:id="rId59">
         <w:r>
           <w:rPr>
             <w:u w:val="single"/>
@@ -3145,7 +3130,7 @@
           <w:b w:val="0"/>
           <w:i w:val="0"/>
         </w:rPr>
-        <w:t xml:space="preserve"> through Canvas. The final literature review deadline is confirmed as Tuesday 15 December 2026 at 11:59 PM Central.</w:t>
+        <w:t xml:space="preserve"> through Canvas.</w:t>
       </w:r>
     </w:p>
     <w:p>
@@ -3317,7 +3302,7 @@
           <w:b w:val="0"/>
           <w:i w:val="0"/>
         </w:rPr>
-        <w:t>Self-reflection helps explain your decisions. It does not automatically determine your grade. The 479 self-grading scheme and separate peer-commentary components have been replaced by 590's staged assignments and two graded peer reviews.</w:t>
+        <w:t>Self-reflection helps explain your decisions. It does not automatically determine your grade.</w:t>
       </w:r>
     </w:p>
     <w:p>
@@ -3616,7 +3601,7 @@
           <w:b w:val="0"/>
           <w:i w:val="0"/>
         </w:rPr>
-        <w:t>Share only the material needed for the exercise. Use named recipients and institution-supported arrangements. Students may use an anonymized extract or an instructor-mediated alternative. Keep grades and private instructor comments in Canvas. Canvas assigns each student two classmates’ submissions once the task’s deadline passes. If you would rather not share your draft, tell me before the deadline and we will use an anonymized extract or route the exchange through me.</w:t>
+        <w:t>Share only the material needed for the exercise. Canvas assigns each student two classmates’ submissions once the task’s deadline passes. If you would rather not share your draft, tell me before the deadline and we will use an anonymized extract or route the exchange through me.</w:t>
       </w:r>
     </w:p>
     <w:p>
@@ -4708,7 +4693,7 @@
         <w:pStyle w:val="Heading1"/>
       </w:pPr>
       <w:r>
-        <w:t>Campus Academic Policies and Course Arrangements</w:t>
+        <w:t>Course Policies</w:t>
       </w:r>
     </w:p>
     <w:p>
@@ -4726,7 +4711,7 @@
         </w:rPr>
         <w:t xml:space="preserve"> I hope you can join every seminar, because the discussion and workshops are where much of the learning happens. I also know that graduate students balance work, family, health and other commitments. Attendance is not graded, and you do not need to explain or document an absence. If you miss a seminar, catch up from the slides and Canvas materials, and contact me if you would like to talk through that week's task. Absences covered by the </w:t>
       </w:r>
-      <w:hyperlink r:id="rId61">
+      <w:hyperlink r:id="rId60">
         <w:r>
           <w:rPr>
             <w:u w:val="single"/>
@@ -4786,6 +4771,392 @@
           <w:i w:val="0"/>
         </w:rPr>
         <w:t xml:space="preserve"> Seminars are recorded on Zoom, and links to the recordings are posted on Canvas each week, so you can review a session or catch up on one you missed. Breakout rooms are not recorded. If you would rather not appear in a recording, keep your camera off, change your display name, or contribute through the chat. Recordings and the class Google Doc are for students enrolled in this course only: do not download, share or post them outside the course, and do not make your own recordings of seminars without asking me first.</w:t>
+      </w:r>
+    </w:p>
+    <w:p>
+      <w:pPr>
+        <w:pStyle w:val="Heading1"/>
+      </w:pPr>
+      <w:r>
+        <w:t>University Policies and Resources</w:t>
+      </w:r>
+    </w:p>
+    <w:p>
+      <w:r>
+        <w:rPr>
+          <w:b/>
+          <w:i w:val="0"/>
+        </w:rPr>
+        <w:t>Academic integrity.</w:t>
+      </w:r>
+      <w:r>
+        <w:rPr>
+          <w:b w:val="0"/>
+          <w:i w:val="0"/>
+        </w:rPr>
+        <w:t xml:space="preserve"> The University’s academic-integrity policy is in the </w:t>
+      </w:r>
+      <w:hyperlink r:id="rId61">
+        <w:r>
+          <w:rPr>
+            <w:u w:val="single"/>
+          </w:rPr>
+          <w:t>Student Code, Article 1, Part 4</w:t>
+        </w:r>
+      </w:hyperlink>
+      <w:r>
+        <w:rPr>
+          <w:b w:val="0"/>
+          <w:i w:val="0"/>
+        </w:rPr>
+        <w:t>. It covers plagiarism, fabrication and other violations, including presenting AI-generated work or invented references as your own scholarship. This course’s AI-use expectations are set out above. If you are unsure whether something is permitted, ask before you submit.</w:t>
+      </w:r>
+    </w:p>
+    <w:p>
+      <w:r>
+        <w:rPr>
+          <w:b/>
+          <w:i w:val="0"/>
+        </w:rPr>
+        <w:t>Disability-related accommodations.</w:t>
+      </w:r>
+      <w:r>
+        <w:rPr>
+          <w:b w:val="0"/>
+          <w:i w:val="0"/>
+        </w:rPr>
+        <w:t xml:space="preserve"> To obtain disability-related academic adjustments or auxiliary aids, contact me as soon as possible and provide a Letter of Academic Accommodations from </w:t>
+      </w:r>
+      <w:hyperlink r:id="rId62">
+        <w:r>
+          <w:rPr>
+            <w:u w:val="single"/>
+          </w:rPr>
+          <w:t>Disability Resources and Educational Services (DRES)</w:t>
+        </w:r>
+      </w:hyperlink>
+      <w:r>
+        <w:rPr>
+          <w:b w:val="0"/>
+          <w:i w:val="0"/>
+        </w:rPr>
+        <w:t>. If you need accommodations, apply for services with DRES as early as you can (</w:t>
+      </w:r>
+      <w:hyperlink r:id="rId63">
+        <w:r>
+          <w:rPr>
+            <w:u w:val="single"/>
+          </w:rPr>
+          <w:t>apply here</w:t>
+        </w:r>
+      </w:hyperlink>
+      <w:r>
+        <w:rPr>
+          <w:b w:val="0"/>
+          <w:i w:val="0"/>
+        </w:rPr>
+        <w:t>). DRES is at 1207 S. Oak St., Champaign; 217-333-1970; disability@illinois.edu. If you think an undiagnosed condition is affecting your studies, DRES also offers academic screening appointments.</w:t>
+      </w:r>
+    </w:p>
+    <w:p>
+      <w:r>
+        <w:rPr>
+          <w:b/>
+          <w:i w:val="0"/>
+        </w:rPr>
+        <w:t>Religious observances.</w:t>
+      </w:r>
+      <w:r>
+        <w:rPr>
+          <w:b w:val="0"/>
+          <w:i w:val="0"/>
+        </w:rPr>
+        <w:t xml:space="preserve"> Illinois law requires the University to reasonably accommodate students’ religious beliefs, observances and practices in regard to class attendance and the scheduling of work requirements. Check this syllabus for conflicts with your observances and tell me as early as possible, and within the first two weeks of the term, so we can arrange an accommodation.</w:t>
+      </w:r>
+    </w:p>
+    <w:p>
+      <w:r>
+        <w:rPr>
+          <w:b/>
+          <w:i w:val="0"/>
+        </w:rPr>
+        <w:t>Community of Care.</w:t>
+      </w:r>
+      <w:r>
+        <w:rPr>
+          <w:b w:val="0"/>
+          <w:i w:val="0"/>
+        </w:rPr>
+        <w:t xml:space="preserve"> As members of the Illinois community, we each have a responsibility to express care and concern for one another. If a classmate’s behavior concerns you, whether for their well-being or yours, you can refer it to the Dean of Students’ CARE Center (formerly the Student Assistance Center): 217-333-0050 or the </w:t>
+      </w:r>
+      <w:hyperlink r:id="rId64">
+        <w:r>
+          <w:rPr>
+            <w:u w:val="single"/>
+          </w:rPr>
+          <w:t>Community of Care referral form</w:t>
+        </w:r>
+      </w:hyperlink>
+      <w:r>
+        <w:rPr>
+          <w:b w:val="0"/>
+          <w:i w:val="0"/>
+        </w:rPr>
+        <w:t>. If you face a challenge that is affecting your coursework, such as a mental health concern, food insecurity, housing loss or a personal emergency, the CARE Center can offer support and referrals.</w:t>
+      </w:r>
+    </w:p>
+    <w:p>
+      <w:r>
+        <w:rPr>
+          <w:b/>
+          <w:i w:val="0"/>
+        </w:rPr>
+        <w:t>Mental health.</w:t>
+      </w:r>
+      <w:r>
+        <w:rPr>
+          <w:b w:val="0"/>
+          <w:i w:val="0"/>
+        </w:rPr>
+        <w:t xml:space="preserve"> Significant stress, mood changes, excessive worry, substance or alcohol misuse, or changes in eating or sleep can affect academic performance and wellbeing. The University offers confidential services, including counseling, crisis intervention and psychiatric services, covered by the Student Health Fee. Getting help is a smart and courageous thing to do.</w:t>
+      </w:r>
+    </w:p>
+    <w:p>
+      <w:pPr>
+        <w:pStyle w:val="ListBullet"/>
+      </w:pPr>
+      <w:hyperlink r:id="rId65">
+        <w:r>
+          <w:rPr>
+            <w:u w:val="single"/>
+          </w:rPr>
+          <w:t>Counseling Center</w:t>
+        </w:r>
+      </w:hyperlink>
+      <w:r>
+        <w:rPr>
+          <w:b w:val="0"/>
+          <w:i w:val="0"/>
+        </w:rPr>
+        <w:t>: 217-333-3704</w:t>
+      </w:r>
+    </w:p>
+    <w:p>
+      <w:pPr>
+        <w:pStyle w:val="ListBullet"/>
+      </w:pPr>
+      <w:r>
+        <w:rPr>
+          <w:b w:val="0"/>
+          <w:i w:val="0"/>
+        </w:rPr>
+        <w:t>McKinley Health Center: 217-333-2700</w:t>
+      </w:r>
+    </w:p>
+    <w:p>
+      <w:pPr>
+        <w:pStyle w:val="ListBullet"/>
+      </w:pPr>
+      <w:r>
+        <w:rPr>
+          <w:b w:val="0"/>
+          <w:i w:val="0"/>
+        </w:rPr>
+        <w:t>988 Suicide and Crisis Lifeline: call or text 988</w:t>
+      </w:r>
+    </w:p>
+    <w:p>
+      <w:pPr>
+        <w:pStyle w:val="ListBullet"/>
+      </w:pPr>
+      <w:r>
+        <w:rPr>
+          <w:b w:val="0"/>
+          <w:i w:val="0"/>
+        </w:rPr>
+        <w:t>Rosecrance Crisis Line: 217-359-4141 (24/7)</w:t>
+      </w:r>
+    </w:p>
+    <w:p>
+      <w:pPr>
+        <w:pStyle w:val="ListBullet"/>
+      </w:pPr>
+      <w:r>
+        <w:rPr>
+          <w:b w:val="0"/>
+          <w:i w:val="0"/>
+        </w:rPr>
+        <w:t>If you are in immediate danger, call 911.</w:t>
+      </w:r>
+    </w:p>
+    <w:p>
+      <w:r>
+        <w:rPr>
+          <w:b/>
+          <w:i w:val="0"/>
+        </w:rPr>
+        <w:t>Sexual misconduct reporting obligation.</w:t>
+      </w:r>
+      <w:r>
+        <w:rPr>
+          <w:b w:val="0"/>
+          <w:i w:val="0"/>
+        </w:rPr>
+        <w:t xml:space="preserve"> The University of Illinois is committed to combating sexual misconduct. Faculty and staff members are required to report any instances of sexual misconduct to the University’s Title IX Office, which will provide information about rights and options, including accommodations, support services, the campus disciplinary process and law enforcement options. Counselors, confidential advisors and medical professionals do not have this reporting responsibility; see the </w:t>
+      </w:r>
+      <w:hyperlink r:id="rId66">
+        <w:r>
+          <w:rPr>
+            <w:u w:val="single"/>
+          </w:rPr>
+          <w:t>list of confidential resources</w:t>
+        </w:r>
+      </w:hyperlink>
+      <w:r>
+        <w:rPr>
+          <w:b w:val="0"/>
+          <w:i w:val="0"/>
+        </w:rPr>
+        <w:t xml:space="preserve"> and </w:t>
+      </w:r>
+      <w:hyperlink r:id="rId36">
+        <w:r>
+          <w:rPr>
+            <w:u w:val="single"/>
+          </w:rPr>
+          <w:t>We Care</w:t>
+        </w:r>
+      </w:hyperlink>
+      <w:r>
+        <w:rPr>
+          <w:b w:val="0"/>
+          <w:i w:val="0"/>
+        </w:rPr>
+        <w:t xml:space="preserve"> for more on resources and reporting.</w:t>
+      </w:r>
+    </w:p>
+    <w:p>
+      <w:r>
+        <w:rPr>
+          <w:b/>
+          <w:i w:val="0"/>
+        </w:rPr>
+        <w:t>Bias and inclusion.</w:t>
+      </w:r>
+      <w:r>
+        <w:rPr>
+          <w:b w:val="0"/>
+          <w:i w:val="0"/>
+        </w:rPr>
+        <w:t xml:space="preserve"> Everyone in this course should be able to contribute without ridicule or intolerant language. If you witness or experience discrimination or other offensive behavior, tell me if you feel comfortable doing so, or report it to the </w:t>
+      </w:r>
+      <w:hyperlink r:id="rId67">
+        <w:r>
+          <w:rPr>
+            <w:u w:val="single"/>
+          </w:rPr>
+          <w:t>Bias Assessment and Response Team (BART)</w:t>
+        </w:r>
+      </w:hyperlink>
+      <w:r>
+        <w:rPr>
+          <w:b w:val="0"/>
+          <w:i w:val="0"/>
+        </w:rPr>
+        <w:t>.</w:t>
+      </w:r>
+    </w:p>
+    <w:p>
+      <w:r>
+        <w:rPr>
+          <w:b/>
+          <w:i w:val="0"/>
+        </w:rPr>
+        <w:t>Privacy (FERPA).</w:t>
+      </w:r>
+      <w:r>
+        <w:rPr>
+          <w:b w:val="0"/>
+          <w:i w:val="0"/>
+        </w:rPr>
+        <w:t xml:space="preserve"> If you have suppressed your directory information under the Family Educational Rights and Privacy Act, let me know so your privacy in seminars and shared documents can be protected. See the </w:t>
+      </w:r>
+      <w:hyperlink r:id="rId21">
+        <w:r>
+          <w:rPr>
+            <w:u w:val="single"/>
+          </w:rPr>
+          <w:t>Registrar’s FERPA page</w:t>
+        </w:r>
+      </w:hyperlink>
+      <w:r>
+        <w:rPr>
+          <w:b w:val="0"/>
+          <w:i w:val="0"/>
+        </w:rPr>
+        <w:t>.</w:t>
+      </w:r>
+    </w:p>
+    <w:p>
+      <w:r>
+        <w:rPr>
+          <w:b/>
+          <w:i w:val="0"/>
+        </w:rPr>
+        <w:t>Disruptive behavior.</w:t>
+      </w:r>
+      <w:r>
+        <w:rPr>
+          <w:b w:val="0"/>
+          <w:i w:val="0"/>
+        </w:rPr>
+        <w:t xml:space="preserve"> Behavior that persistently or grossly interferes with class activities, including online seminars, may be referred to the </w:t>
+      </w:r>
+      <w:hyperlink r:id="rId29">
+        <w:r>
+          <w:rPr>
+            <w:u w:val="single"/>
+          </w:rPr>
+          <w:t>Office for Student Conflict Resolution</w:t>
+        </w:r>
+      </w:hyperlink>
+      <w:r>
+        <w:rPr>
+          <w:b w:val="0"/>
+          <w:i w:val="0"/>
+        </w:rPr>
+        <w:t>.</w:t>
+      </w:r>
+    </w:p>
+    <w:p>
+      <w:r>
+        <w:rPr>
+          <w:b/>
+          <w:i w:val="0"/>
+        </w:rPr>
+        <w:t>Emergency response.</w:t>
+      </w:r>
+      <w:r>
+        <w:rPr>
+          <w:b w:val="0"/>
+          <w:i w:val="0"/>
+        </w:rPr>
+        <w:t xml:space="preserve"> Emergency response recommendations are at the </w:t>
+      </w:r>
+      <w:hyperlink r:id="rId68">
+        <w:r>
+          <w:rPr>
+            <w:u w:val="single"/>
+          </w:rPr>
+          <w:t>Division of Public Safety’s emergency preparedness page</w:t>
+        </w:r>
+      </w:hyperlink>
+      <w:r>
+        <w:rPr>
+          <w:b w:val="0"/>
+          <w:i w:val="0"/>
+        </w:rPr>
+        <w:t>.</w:t>
       </w:r>
     </w:p>
     <w:p>
@@ -5786,7 +6157,7 @@
                 <w:i w:val="0"/>
                 <w:sz w:val="19"/>
               </w:rPr>
-              <w:t>Bring an outline and draft; sociology-of-knowledge reading to be selected</w:t>
+              <w:t>Bring an outline and draft; readings from your own project</w:t>
             </w:r>
           </w:p>
         </w:tc>
@@ -6106,7 +6477,7 @@
                 <w:i w:val="0"/>
                 <w:sz w:val="19"/>
               </w:rPr>
-              <w:t>Revisit the draft and AI-use record; reflection reading to be selected</w:t>
+              <w:t>Revisit the draft and AI-use record; readings from your own project</w:t>
             </w:r>
           </w:p>
         </w:tc>
@@ -6266,7 +6637,7 @@
                 <w:i w:val="0"/>
                 <w:sz w:val="19"/>
               </w:rPr>
-              <w:t>Bring a complete working draft; selected case on automation</w:t>
+              <w:t>Bring a complete working draft</w:t>
             </w:r>
           </w:p>
         </w:tc>
@@ -6490,182 +6861,7 @@
           <w:b w:val="0"/>
           <w:i w:val="0"/>
         </w:rPr>
-        <w:t>Session 7 prioritizes the final review. Future-facing AI demonstrations should be selected to clarify a scholarly problem, leaving enough time for feedback and revision.</w:t>
-      </w:r>
-    </w:p>
-    <w:p>
-      <w:pPr>
-        <w:pStyle w:val="Heading1"/>
-      </w:pPr>
-      <w:r>
-        <w:t>Instructor Completion Checklist</w:t>
-      </w:r>
-    </w:p>
-    <w:p>
-      <w:pPr>
-        <w:pStyle w:val="ListBullet"/>
-      </w:pPr>
-      <w:r>
-        <w:rPr>
-          <w:b w:val="0"/>
-          <w:i w:val="0"/>
-        </w:rPr>
-        <w:t>[x] EPOL 590, Section AIL, CRN 73886, 4 credit hours; online Mondays 5:00–7:50 PM Central.</w:t>
-      </w:r>
-    </w:p>
-    <w:p>
-      <w:pPr>
-        <w:pStyle w:val="ListBullet"/>
-      </w:pPr>
-      <w:r>
-        <w:rPr>
-          <w:b w:val="0"/>
-          <w:i w:val="0"/>
-        </w:rPr>
-        <w:t>[x] Final literature review due Tuesday 15 December 2026 at 11:59 PM Central.</w:t>
-      </w:r>
-    </w:p>
-    <w:p>
-      <w:pPr>
-        <w:pStyle w:val="ListBullet"/>
-      </w:pPr>
-      <w:r>
-        <w:rPr>
-          <w:b w:val="0"/>
-          <w:i w:val="0"/>
-        </w:rPr>
-        <w:t>[x] Set lengths, source expectations, submission formats, and task rubrics (Task 7 rubric drafted for review).</w:t>
-      </w:r>
-    </w:p>
-    <w:p>
-      <w:pPr>
-        <w:pStyle w:val="ListBullet"/>
-      </w:pPr>
-      <w:r>
-        <w:rPr>
-          <w:b w:val="0"/>
-          <w:i w:val="0"/>
-        </w:rPr>
-        <w:t>[ ] Replace the research-question guide (Minnesota link is dead).</w:t>
-      </w:r>
-    </w:p>
-    <w:p>
-      <w:pPr>
-        <w:pStyle w:val="ListBullet"/>
-      </w:pPr>
-      <w:r>
-        <w:rPr>
-          <w:b w:val="0"/>
-          <w:i w:val="0"/>
-        </w:rPr>
-        <w:t>[x] Confirm the feedback schedule and peer-work alternatives.</w:t>
-      </w:r>
-    </w:p>
-    <w:p>
-      <w:pPr>
-        <w:pStyle w:val="ListBullet"/>
-      </w:pPr>
-      <w:r>
-        <w:rPr>
-          <w:b w:val="0"/>
-          <w:i w:val="0"/>
-        </w:rPr>
-        <w:t>[x] Create fresh collaborative documents (EPOL 590 Fall 2026 Google Doc). Check student access.</w:t>
-      </w:r>
-    </w:p>
-    <w:p>
-      <w:pPr>
-        <w:pStyle w:val="ListBullet"/>
-      </w:pPr>
-      <w:r>
-        <w:rPr>
-          <w:b w:val="0"/>
-          <w:i w:val="0"/>
-        </w:rPr>
-        <w:t>[x] Grading, late work, recording, AI, accessibility and support policies.</w:t>
-      </w:r>
-    </w:p>
-    <w:p>
-      <w:pPr>
-        <w:pStyle w:val="ListBullet"/>
-      </w:pPr>
-      <w:r>
-        <w:rPr>
-          <w:b w:val="0"/>
-          <w:i w:val="0"/>
-        </w:rPr>
-        <w:t>[x] Create Canvas assignments with weights and dates totaling 100%.</w:t>
-      </w:r>
-    </w:p>
-    <w:p>
-      <w:pPr>
-        <w:pStyle w:val="Heading1"/>
-      </w:pPr>
-      <w:r>
-        <w:t>Adaptation and Calendar Sources</w:t>
-      </w:r>
-    </w:p>
-    <w:p>
-      <w:r>
-        <w:rPr>
-          <w:b w:val="0"/>
-          <w:i w:val="0"/>
-        </w:rPr>
-        <w:t xml:space="preserve">Structure adapted from </w:t>
-      </w:r>
-      <w:hyperlink r:id="rId62">
-        <w:r>
-          <w:rPr>
-            <w:u w:val="single"/>
-          </w:rPr>
-          <w:t>EPOL 479 Fall 2026 syllabus</w:t>
-        </w:r>
-      </w:hyperlink>
-      <w:r>
-        <w:rPr>
-          <w:b w:val="0"/>
-          <w:i w:val="0"/>
-        </w:rPr>
-        <w:t xml:space="preserve">. Course content and starting weights come from the </w:t>
-      </w:r>
-      <w:hyperlink r:id="rId63">
-        <w:r>
-          <w:rPr>
-            <w:u w:val="single"/>
-          </w:rPr>
-          <w:t>590 materials</w:t>
-        </w:r>
-      </w:hyperlink>
-      <w:r>
-        <w:rPr>
-          <w:b w:val="0"/>
-          <w:i w:val="0"/>
-        </w:rPr>
-        <w:t>.</w:t>
-      </w:r>
-    </w:p>
-    <w:p>
-      <w:r>
-        <w:rPr>
-          <w:b w:val="0"/>
-          <w:i w:val="0"/>
-        </w:rPr>
-        <w:t xml:space="preserve">Official calendar anchors: </w:t>
-      </w:r>
-      <w:hyperlink r:id="rId64">
-        <w:r>
-          <w:rPr>
-            <w:u w:val="single"/>
-          </w:rPr>
-          <w:t>Illinois Registrar Fall 2026 academic calendar</w:t>
-        </w:r>
-      </w:hyperlink>
-      <w:r>
-        <w:rPr>
-          <w:b w:val="0"/>
-          <w:i w:val="0"/>
-        </w:rPr>
-        <w:t>: Term B begins 19 October; fall break is 21–29 November; instruction ends 9 December; reading day is 10 December; final examinations run on weekdays 11–17 December; faculty grades are due 22 December at 2:00 PM. The final review deadline is confirmed as 15 December 2026 at 11:59 PM Central.</w:t>
+        <w:t>Session 7 prioritizes the final review, with a short look at where AI is taking scholarship and plenty of time for feedback and revision.</w:t>
       </w:r>
     </w:p>
     <w:sectPr>

</xml_diff>

<commit_message>
590: fix dead DRES and emergency links; drop Minnesota guide from Lecture 1
Co-Authored-By: Claude Opus 5.5 <noreply@anthropic.com>
</commit_message>
<xml_diff>
--- a/courses/590-fall-2026/syllabus/University-of-Illinois-Urbana-Champaign-Syllabus-590-Fall-2026.docx
+++ b/courses/590-fall-2026/syllabus/University-of-Illinois-Urbana-Champaign-Syllabus-590-Fall-2026.docx
@@ -4827,7 +4827,7 @@
         </w:rPr>
         <w:t xml:space="preserve"> To obtain disability-related academic adjustments or auxiliary aids, contact me as soon as possible and provide a Letter of Academic Accommodations from </w:t>
       </w:r>
-      <w:hyperlink r:id="rId62">
+      <w:hyperlink r:id="rId20">
         <w:r>
           <w:rPr>
             <w:u w:val="single"/>
@@ -4842,7 +4842,7 @@
         </w:rPr>
         <w:t>. If you need accommodations, apply for services with DRES as early as you can (</w:t>
       </w:r>
-      <w:hyperlink r:id="rId63">
+      <w:hyperlink r:id="rId62">
         <w:r>
           <w:rPr>
             <w:u w:val="single"/>
@@ -4889,7 +4889,7 @@
         </w:rPr>
         <w:t xml:space="preserve"> As members of the Illinois community, we each have a responsibility to express care and concern for one another. If a classmate’s behavior concerns you, whether for their well-being or yours, you can refer it to the Dean of Students’ CARE Center (formerly the Student Assistance Center): 217-333-0050 or the </w:t>
       </w:r>
-      <w:hyperlink r:id="rId64">
+      <w:hyperlink r:id="rId63">
         <w:r>
           <w:rPr>
             <w:u w:val="single"/>
@@ -4925,7 +4925,7 @@
       <w:pPr>
         <w:pStyle w:val="ListBullet"/>
       </w:pPr>
-      <w:hyperlink r:id="rId65">
+      <w:hyperlink r:id="rId64">
         <w:r>
           <w:rPr>
             <w:u w:val="single"/>
@@ -5004,7 +5004,7 @@
         </w:rPr>
         <w:t xml:space="preserve"> The University of Illinois is committed to combating sexual misconduct. Faculty and staff members are required to report any instances of sexual misconduct to the University’s Title IX Office, which will provide information about rights and options, including accommodations, support services, the campus disciplinary process and law enforcement options. Counselors, confidential advisors and medical professionals do not have this reporting responsibility; see the </w:t>
       </w:r>
-      <w:hyperlink r:id="rId66">
+      <w:hyperlink r:id="rId65">
         <w:r>
           <w:rPr>
             <w:u w:val="single"/>
@@ -5050,7 +5050,7 @@
         </w:rPr>
         <w:t xml:space="preserve"> Everyone in this course should be able to contribute without ridicule or intolerant language. If you witness or experience discrimination or other offensive behavior, tell me if you feel comfortable doing so, or report it to the </w:t>
       </w:r>
-      <w:hyperlink r:id="rId67">
+      <w:hyperlink r:id="rId66">
         <w:r>
           <w:rPr>
             <w:u w:val="single"/>
@@ -5143,7 +5143,7 @@
         </w:rPr>
         <w:t xml:space="preserve"> Emergency response recommendations are at the </w:t>
       </w:r>
-      <w:hyperlink r:id="rId68">
+      <w:hyperlink r:id="rId67">
         <w:r>
           <w:rPr>
             <w:u w:val="single"/>

</xml_diff>

<commit_message>
590: Weber read online; University Library research-question guide
Weber links to the 1946 Oxford edition on the Internet Archive (not in
copyright), pp. 129-156. The dead Minnesota guide is replaced by the
University Library's 'Develop a topic and dissect your research question'.
Deck readings slide synced; hosted Lecture 1 rebuilt.

Co-Authored-By: Claude Opus 5.5 <noreply@anthropic.com>
</commit_message>
<xml_diff>
--- a/courses/590-fall-2026/syllabus/University-of-Illinois-Urbana-Champaign-Syllabus-590-Fall-2026.docx
+++ b/courses/590-fall-2026/syllabus/University-of-Illinois-Urbana-Champaign-Syllabus-590-Fall-2026.docx
@@ -1099,8 +1099,16 @@
           <w:b w:val="0"/>
           <w:i w:val="0"/>
         </w:rPr>
-        <w:t xml:space="preserve"> (pp. 129–156). Oxford University Press.</w:t>
-      </w:r>
+        <w:t xml:space="preserve"> (pp. 129–156). Oxford University Press. </w:t>
+      </w:r>
+      <w:hyperlink r:id="rId55">
+        <w:r>
+          <w:rPr>
+            <w:u w:val="single"/>
+          </w:rPr>
+          <w:t>Read online (Internet Archive)</w:t>
+        </w:r>
+      </w:hyperlink>
     </w:p>
     <w:p>
       <w:pPr>
@@ -1111,7 +1119,22 @@
           <w:b w:val="0"/>
           <w:i w:val="0"/>
         </w:rPr>
-        <w:t>A short guide to writing research questions (link posted on Canvas).</w:t>
+        <w:t xml:space="preserve">University of Illinois Library. (n.d.). </w:t>
+      </w:r>
+      <w:hyperlink r:id="rId56">
+        <w:r>
+          <w:rPr>
+            <w:u w:val="single"/>
+          </w:rPr>
+          <w:t>Develop a topic and dissect your research question</w:t>
+        </w:r>
+      </w:hyperlink>
+      <w:r>
+        <w:rPr>
+          <w:b w:val="0"/>
+          <w:i w:val="0"/>
+        </w:rPr>
+        <w:t>.</w:t>
       </w:r>
     </w:p>
     <w:p>
@@ -1133,7 +1156,7 @@
         </w:rPr>
         <w:t xml:space="preserve">Purdue Online Writing Lab. (n.d.). </w:t>
       </w:r>
-      <w:hyperlink r:id="rId55">
+      <w:hyperlink r:id="rId57">
         <w:r>
           <w:rPr>
             <w:u w:val="single"/>
@@ -1174,7 +1197,7 @@
         </w:rPr>
         <w:t xml:space="preserve">. </w:t>
       </w:r>
-      <w:hyperlink r:id="rId56">
+      <w:hyperlink r:id="rId58">
         <w:r>
           <w:rPr>
             <w:u w:val="single"/>
@@ -1208,7 +1231,7 @@
         </w:rPr>
         <w:t xml:space="preserve">, Article 105473. </w:t>
       </w:r>
-      <w:hyperlink r:id="rId57">
+      <w:hyperlink r:id="rId59">
         <w:r>
           <w:rPr>
             <w:u w:val="single"/>
@@ -1276,7 +1299,7 @@
         </w:rPr>
         <w:t xml:space="preserve">. Cambridge University Press. </w:t>
       </w:r>
-      <w:hyperlink r:id="rId58">
+      <w:hyperlink r:id="rId60">
         <w:r>
           <w:rPr>
             <w:u w:val="single"/>
@@ -1318,7 +1341,7 @@
         </w:rPr>
         <w:t xml:space="preserve"> (pp. 271–313). University of Illinois Press. </w:t>
       </w:r>
-      <w:hyperlink r:id="rId59">
+      <w:hyperlink r:id="rId61">
         <w:r>
           <w:rPr>
             <w:u w:val="single"/>
@@ -4711,7 +4734,7 @@
         </w:rPr>
         <w:t xml:space="preserve"> I hope you can join every seminar, because the discussion and workshops are where much of the learning happens. I also know that graduate students balance work, family, health and other commitments. Attendance is not graded, and you do not need to explain or document an absence. If you miss a seminar, catch up from the slides and Canvas materials, and contact me if you would like to talk through that week's task. Absences covered by the </w:t>
       </w:r>
-      <w:hyperlink r:id="rId60">
+      <w:hyperlink r:id="rId62">
         <w:r>
           <w:rPr>
             <w:u w:val="single"/>
@@ -4796,7 +4819,7 @@
         </w:rPr>
         <w:t xml:space="preserve"> The University’s academic-integrity policy is in the </w:t>
       </w:r>
-      <w:hyperlink r:id="rId61">
+      <w:hyperlink r:id="rId63">
         <w:r>
           <w:rPr>
             <w:u w:val="single"/>
@@ -4842,7 +4865,7 @@
         </w:rPr>
         <w:t>. If you need accommodations, apply for services with DRES as early as you can (</w:t>
       </w:r>
-      <w:hyperlink r:id="rId62">
+      <w:hyperlink r:id="rId64">
         <w:r>
           <w:rPr>
             <w:u w:val="single"/>
@@ -4889,7 +4912,7 @@
         </w:rPr>
         <w:t xml:space="preserve"> As members of the Illinois community, we each have a responsibility to express care and concern for one another. If a classmate’s behavior concerns you, whether for their well-being or yours, you can refer it to the Dean of Students’ CARE Center (formerly the Student Assistance Center): 217-333-0050 or the </w:t>
       </w:r>
-      <w:hyperlink r:id="rId63">
+      <w:hyperlink r:id="rId65">
         <w:r>
           <w:rPr>
             <w:u w:val="single"/>
@@ -4925,7 +4948,7 @@
       <w:pPr>
         <w:pStyle w:val="ListBullet"/>
       </w:pPr>
-      <w:hyperlink r:id="rId64">
+      <w:hyperlink r:id="rId66">
         <w:r>
           <w:rPr>
             <w:u w:val="single"/>
@@ -5004,7 +5027,7 @@
         </w:rPr>
         <w:t xml:space="preserve"> The University of Illinois is committed to combating sexual misconduct. Faculty and staff members are required to report any instances of sexual misconduct to the University’s Title IX Office, which will provide information about rights and options, including accommodations, support services, the campus disciplinary process and law enforcement options. Counselors, confidential advisors and medical professionals do not have this reporting responsibility; see the </w:t>
       </w:r>
-      <w:hyperlink r:id="rId65">
+      <w:hyperlink r:id="rId67">
         <w:r>
           <w:rPr>
             <w:u w:val="single"/>
@@ -5050,7 +5073,7 @@
         </w:rPr>
         <w:t xml:space="preserve"> Everyone in this course should be able to contribute without ridicule or intolerant language. If you witness or experience discrimination or other offensive behavior, tell me if you feel comfortable doing so, or report it to the </w:t>
       </w:r>
-      <w:hyperlink r:id="rId66">
+      <w:hyperlink r:id="rId68">
         <w:r>
           <w:rPr>
             <w:u w:val="single"/>
@@ -5143,7 +5166,7 @@
         </w:rPr>
         <w:t xml:space="preserve"> Emergency response recommendations are at the </w:t>
       </w:r>
-      <w:hyperlink r:id="rId67">
+      <w:hyperlink r:id="rId69">
         <w:r>
           <w:rPr>
             <w:u w:val="single"/>

</xml_diff>